<commit_message>
Guia: Res. CJF 995/2026, RPV e precatório federal só com crédito definitivo
Co-Authored-By: Claude Opus 5.5 <noreply@anthropic.com>
Claude-Session: https://claude.ai/code/session_01Mq6ZQP693ULw6cXrUQHtMf
</commit_message>
<xml_diff>
--- a/arquivos/modelo-pedido-de-expedicao-de-rpv.docx
+++ b/arquivos/modelo-pedido-de-expedicao-de-rpv.docx
@@ -103,6 +103,21 @@
           <w:sz w:val="24"/>
         </w:rPr>
         <w:t>O valor não excede o limite fixado para requisição de pequeno valor pelo ente devedor, que é de R$ [valor do teto de RPV], estabelecido por [lei do ente devedor, número e artigo / art. 87 do ADCT, se não houver lei própria], aplicável ao caso: a lei é a vigente na data do trânsito em julgado da fase de conhecimento (Resolução CNJ nº 303/2019, art. 47, §3º, na redação da Resolução CNJ nº 438/2021) e, quando o limite é fixado em salários mínimos, o salário mínimo é o vigente na data da expedição da requisição (CNJ, Consulta nº 0000621-21.2023.2.00.0000). [Se a devedora for a União, autarquia ou fundação federal: o limite de RPV é verificado pela atualização do valor até a data de transmissão ao tribunal (Resolução CJF nº 983/2026, art. 3º, §4º).]</w:t>
+      </w:r>
+    </w:p>
+    <w:p>
+      <w:pPr>
+        <w:spacing w:line="360" w:lineRule="auto" w:after="120" w:before="0"/>
+        <w:ind w:firstLine="709"/>
+        <w:jc w:val="both"/>
+      </w:pPr>
+      <w:r>
+        <w:rPr>
+          <w:rFonts w:ascii="Times New Roman" w:hAnsi="Times New Roman"/>
+          <w:b w:val="0"/>
+          <w:sz w:val="24"/>
+        </w:rPr>
+        <w:t>[Justiça Federal: o crédito é líquido, certo e exigível em caráter definitivo. A decisão da fase de conhecimento transitou em julgado em [data]; [não houve impugnação ao cumprimento de sentença nem embargos à execução, e o prazo para apresentá-los decorreu em [data] / a decisão que julgou a impugnação ou os embargos transitou em julgado em [data]], conforme certidão [evento ou identificador da certidão] (Resolução CJF nº 983/2026, art. 9º, inciso XVII, e art. 15, na redação da Resolução CJF nº 995/2026). Se houver impugnação parcial, requerer só a parcela incontroversa e autônoma (art. 15, §2º).]</w:t>
       </w:r>
     </w:p>
     <w:p>
@@ -370,6 +385,21 @@
           <w:sz w:val="24"/>
         </w:rPr>
         <w:t>– Certidão de trânsito em julgado</w:t>
+      </w:r>
+    </w:p>
+    <w:p>
+      <w:pPr>
+        <w:spacing w:line="360" w:lineRule="auto" w:after="120" w:before="0"/>
+        <w:ind w:left="454"/>
+        <w:jc w:val="left"/>
+      </w:pPr>
+      <w:r>
+        <w:rPr>
+          <w:rFonts w:ascii="Times New Roman" w:hAnsi="Times New Roman"/>
+          <w:b w:val="0"/>
+          <w:sz w:val="24"/>
+        </w:rPr>
+        <w:t>– [Justiça Federal:] certidão de trânsito da decisão da impugnação ou dos embargos, ou de decurso do prazo sem oposição</w:t>
       </w:r>
     </w:p>
     <w:p>

</xml_diff>